<commit_message>
docs(sdr): add Google Maps + Outscraper as local-business lead source (§4)
Co-Authored-By: Claude Opus 4.8 (1M context) <noreply@anthropic.com>
</commit_message>
<xml_diff>
--- a/PRODUCTS/03-contact-research-enrichment.docx
+++ b/PRODUCTS/03-contact-research-enrichment.docx
@@ -3014,6 +3014,93 @@
           <w:rFonts w:cs="Arial"/>
         </w:rPr>
         <w:t xml:space="preserve"> (hiQ נגמר עם צו מניעה + $500k; רק דרך session של המשתמש).</w:t>
+      </w:r>
+    </w:p>
+    <w:p>
+      <w:pPr>
+        <w:bidi w:val="1"/>
+        <w:jc w:val="right"/>
+      </w:pPr>
+      <w:r>
+        <w:rPr>
+          <w:rFonts w:ascii="Arial" w:hAnsi="Arial"/>
+          <w:b/>
+          <w:sz w:val="22"/>
+          <w:rtl w:val="1"/>
+          <w:rFonts w:cs="Arial"/>
+        </w:rPr>
+        <w:t>מקור נוסף — לידים מעסקים מקומיים (🆕):</w:t>
+      </w:r>
+      <w:r>
+        <w:rPr>
+          <w:rFonts w:ascii="Arial" w:hAnsi="Arial"/>
+          <w:b w:val="0"/>
+          <w:sz w:val="22"/>
+          <w:rtl w:val="1"/>
+          <w:rFonts w:cs="Arial"/>
+        </w:rPr>
+        <w:t xml:space="preserve"> </w:t>
+      </w:r>
+      <w:r>
+        <w:rPr>
+          <w:rFonts w:ascii="Arial" w:hAnsi="Arial"/>
+          <w:b/>
+          <w:sz w:val="22"/>
+          <w:rtl w:val="1"/>
+          <w:rFonts w:cs="Arial"/>
+        </w:rPr>
+        <w:t>Google Maps API + Outscraper</w:t>
+      </w:r>
+      <w:r>
+        <w:rPr>
+          <w:rFonts w:ascii="Arial" w:hAnsi="Arial"/>
+          <w:b w:val="0"/>
+          <w:sz w:val="22"/>
+          <w:rtl w:val="1"/>
+          <w:rFonts w:cs="Arial"/>
+        </w:rPr>
+        <w:t xml:space="preserve"> לגריפת עסקים לפי אזור/קטגוריה → זרם לידים ל-local-business (בול לישראל: "מספרות בת"א", "מוסכים בחיפה"). רעיון-מקור מ-</w:t>
+      </w:r>
+      <w:r>
+        <w:rPr>
+          <w:rFonts w:ascii="Consolas" w:hAnsi="Consolas"/>
+          <w:b w:val="0"/>
+          <w:color w:val="B02A37"/>
+          <w:sz w:val="22"/>
+          <w:rtl w:val="1"/>
+          <w:rFonts w:cs="Consolas"/>
+        </w:rPr>
+        <w:t>Ambitious-Concepts-Labs/LeadGenerationAPI</w:t>
+      </w:r>
+      <w:r>
+        <w:rPr>
+          <w:rFonts w:ascii="Arial" w:hAnsi="Arial"/>
+          <w:b w:val="0"/>
+          <w:sz w:val="22"/>
+          <w:rtl w:val="1"/>
+          <w:rFonts w:cs="Arial"/>
+        </w:rPr>
+        <w:t xml:space="preserve"> (Python/FastAPI, בלי license — </w:t>
+      </w:r>
+      <w:r>
+        <w:rPr>
+          <w:rFonts w:ascii="Arial" w:hAnsi="Arial"/>
+          <w:b/>
+          <w:sz w:val="22"/>
+          <w:rtl w:val="1"/>
+          <w:rFonts w:cs="Arial"/>
+        </w:rPr>
+        <w:t>רק הרעיון, לא הקוד</w:t>
+      </w:r>
+      <w:r>
+        <w:rPr>
+          <w:rFonts w:ascii="Arial" w:hAnsi="Arial"/>
+          <w:b w:val="0"/>
+          <w:sz w:val="22"/>
+          <w:rtl w:val="1"/>
+          <w:rFonts w:cs="Arial"/>
+        </w:rPr>
+        <w:t>). משלים את ה-waterfall/SpiderFoot בשכבת ה-local-business שחסרה.</w:t>
       </w:r>
     </w:p>
     <w:p>

</xml_diff>